<commit_message>
KF FIlter NL test
</commit_message>
<xml_diff>
--- a/(not-code-related)/Info.docx
+++ b/(not-code-related)/Info.docx
@@ -82,6 +82,9 @@
     </w:p>
     <w:p>
       <w:r>
+        <w:rPr>
+          <w:noProof/>
+        </w:rPr>
         <w:drawing>
           <wp:inline distT="0" distB="0" distL="0" distR="0" wp14:anchorId="43BBEC3D" wp14:editId="194AC3BD">
             <wp:extent cx="5943600" cy="1858645"/>
@@ -172,6 +175,9 @@
     </w:p>
     <w:p>
       <w:r>
+        <w:rPr>
+          <w:noProof/>
+        </w:rPr>
         <w:drawing>
           <wp:inline distT="0" distB="0" distL="0" distR="0" wp14:anchorId="7153E7A7" wp14:editId="02F49DAC">
             <wp:extent cx="2834262" cy="2370667"/>
@@ -212,7 +218,15 @@
     <w:p/>
     <w:p/>
     <w:p>
-      <w:r>
+      <w:pPr>
+        <w:rPr>
+          <w:lang w:val="it-IT"/>
+        </w:rPr>
+      </w:pPr>
+      <w:r>
+        <w:rPr>
+          <w:lang w:val="it-IT"/>
+        </w:rPr>
         <w:t>ZERO ORDER HOLD</w:t>
       </w:r>
     </w:p>
@@ -246,6 +260,9 @@
     <w:p/>
     <w:p>
       <w:r>
+        <w:rPr>
+          <w:noProof/>
+        </w:rPr>
         <w:drawing>
           <wp:inline distT="0" distB="0" distL="0" distR="0" wp14:anchorId="2754CB27" wp14:editId="381D7FD7">
             <wp:extent cx="5943600" cy="2825115"/>
@@ -316,13 +333,419 @@
           <w:lang w:val="it-IT"/>
         </w:rPr>
       </w:pPr>
-    </w:p>
-    <w:p>
-      <w:pPr>
-        <w:rPr>
-          <w:lang w:val="it-IT"/>
-        </w:rPr>
-      </w:pPr>
+      <w:r>
+        <w:rPr>
+          <w:lang w:val="it-IT"/>
+        </w:rPr>
+        <w:t>KALMAN FILTER THEORY</w:t>
+      </w:r>
+    </w:p>
+    <w:p>
+      <w:pPr>
+        <w:rPr>
+          <w:lang w:val="it-IT"/>
+        </w:rPr>
+      </w:pPr>
+      <w:r>
+        <w:rPr>
+          <w:lang w:val="it-IT"/>
+        </w:rPr>
+        <w:t>Stabilization</w:t>
+      </w:r>
+    </w:p>
+    <w:p>
+      <w:pPr>
+        <w:rPr>
+          <w:lang w:val="it-IT"/>
+        </w:rPr>
+      </w:pPr>
+      <w:r>
+        <w:rPr>
+          <w:lang w:val="it-IT"/>
+        </w:rPr>
+        <w:drawing>
+          <wp:inline distT="0" distB="0" distL="0" distR="0" wp14:anchorId="3D17423E" wp14:editId="77F646AA">
+            <wp:extent cx="4823460" cy="1763449"/>
+            <wp:effectExtent l="0" t="0" r="0" b="8255"/>
+            <wp:docPr id="56421007" name="Picture 1"/>
+            <wp:cNvGraphicFramePr>
+              <a:graphicFrameLocks xmlns:a="http://schemas.openxmlformats.org/drawingml/2006/main" noChangeAspect="1"/>
+            </wp:cNvGraphicFramePr>
+            <a:graphic xmlns:a="http://schemas.openxmlformats.org/drawingml/2006/main">
+              <a:graphicData uri="http://schemas.openxmlformats.org/drawingml/2006/picture">
+                <pic:pic xmlns:pic="http://schemas.openxmlformats.org/drawingml/2006/picture">
+                  <pic:nvPicPr>
+                    <pic:cNvPr id="56421007" name=""/>
+                    <pic:cNvPicPr/>
+                  </pic:nvPicPr>
+                  <pic:blipFill>
+                    <a:blip r:embed="rId7"/>
+                    <a:stretch>
+                      <a:fillRect/>
+                    </a:stretch>
+                  </pic:blipFill>
+                  <pic:spPr>
+                    <a:xfrm>
+                      <a:off x="0" y="0"/>
+                      <a:ext cx="4828192" cy="1765179"/>
+                    </a:xfrm>
+                    <a:prstGeom prst="rect">
+                      <a:avLst/>
+                    </a:prstGeom>
+                  </pic:spPr>
+                </pic:pic>
+              </a:graphicData>
+            </a:graphic>
+          </wp:inline>
+        </w:drawing>
+      </w:r>
+    </w:p>
+    <w:p>
+      <w:pPr>
+        <w:rPr>
+          <w:lang w:val="it-IT"/>
+        </w:rPr>
+      </w:pPr>
+      <w:r>
+        <w:rPr>
+          <w:lang w:val="it-IT"/>
+        </w:rPr>
+        <w:lastRenderedPageBreak/>
+        <w:t xml:space="preserve">Fictitious process noise </w:t>
+      </w:r>
+    </w:p>
+    <w:p>
+      <w:pPr>
+        <w:rPr>
+          <w:lang w:val="it-IT"/>
+        </w:rPr>
+      </w:pPr>
+      <w:r>
+        <w:rPr>
+          <w:lang w:val="it-IT"/>
+        </w:rPr>
+        <w:drawing>
+          <wp:inline distT="0" distB="0" distL="0" distR="0" wp14:anchorId="3F49E7CC" wp14:editId="299BE6F6">
+            <wp:extent cx="5943600" cy="2687320"/>
+            <wp:effectExtent l="0" t="0" r="0" b="0"/>
+            <wp:docPr id="482767852" name="Picture 1"/>
+            <wp:cNvGraphicFramePr>
+              <a:graphicFrameLocks xmlns:a="http://schemas.openxmlformats.org/drawingml/2006/main" noChangeAspect="1"/>
+            </wp:cNvGraphicFramePr>
+            <a:graphic xmlns:a="http://schemas.openxmlformats.org/drawingml/2006/main">
+              <a:graphicData uri="http://schemas.openxmlformats.org/drawingml/2006/picture">
+                <pic:pic xmlns:pic="http://schemas.openxmlformats.org/drawingml/2006/picture">
+                  <pic:nvPicPr>
+                    <pic:cNvPr id="482767852" name=""/>
+                    <pic:cNvPicPr/>
+                  </pic:nvPicPr>
+                  <pic:blipFill>
+                    <a:blip r:embed="rId8"/>
+                    <a:stretch>
+                      <a:fillRect/>
+                    </a:stretch>
+                  </pic:blipFill>
+                  <pic:spPr>
+                    <a:xfrm>
+                      <a:off x="0" y="0"/>
+                      <a:ext cx="5943600" cy="2687320"/>
+                    </a:xfrm>
+                    <a:prstGeom prst="rect">
+                      <a:avLst/>
+                    </a:prstGeom>
+                  </pic:spPr>
+                </pic:pic>
+              </a:graphicData>
+            </a:graphic>
+          </wp:inline>
+        </w:drawing>
+      </w:r>
+    </w:p>
+    <w:p>
+      <w:pPr>
+        <w:rPr>
+          <w:lang w:val="it-IT"/>
+        </w:rPr>
+      </w:pPr>
+    </w:p>
+    <w:p>
+      <w:pPr>
+        <w:rPr>
+          <w:lang w:val="it-IT"/>
+        </w:rPr>
+      </w:pPr>
+    </w:p>
+    <w:p>
+      <w:pPr>
+        <w:rPr>
+          <w:lang w:val="it-IT"/>
+        </w:rPr>
+      </w:pPr>
+    </w:p>
+    <w:p>
+      <w:pPr>
+        <w:rPr>
+          <w:lang w:val="it-IT"/>
+        </w:rPr>
+      </w:pPr>
+      <w:r>
+        <w:rPr>
+          <w:lang w:val="it-IT"/>
+        </w:rPr>
+        <w:t xml:space="preserve">FOR TRANSFORMATIONS </w:t>
+      </w:r>
+    </w:p>
+    <w:p>
+      <w:pPr>
+        <w:rPr>
+          <w:lang w:val="it-IT"/>
+        </w:rPr>
+      </w:pPr>
+      <w:r>
+        <w:rPr>
+          <w:lang w:val="it-IT"/>
+        </w:rPr>
+        <w:drawing>
+          <wp:inline distT="0" distB="0" distL="0" distR="0" wp14:anchorId="25B3D79E" wp14:editId="1ACB0062">
+            <wp:extent cx="5943600" cy="3185795"/>
+            <wp:effectExtent l="0" t="0" r="0" b="0"/>
+            <wp:docPr id="757110278" name="Picture 1"/>
+            <wp:cNvGraphicFramePr>
+              <a:graphicFrameLocks xmlns:a="http://schemas.openxmlformats.org/drawingml/2006/main" noChangeAspect="1"/>
+            </wp:cNvGraphicFramePr>
+            <a:graphic xmlns:a="http://schemas.openxmlformats.org/drawingml/2006/main">
+              <a:graphicData uri="http://schemas.openxmlformats.org/drawingml/2006/picture">
+                <pic:pic xmlns:pic="http://schemas.openxmlformats.org/drawingml/2006/picture">
+                  <pic:nvPicPr>
+                    <pic:cNvPr id="757110278" name=""/>
+                    <pic:cNvPicPr/>
+                  </pic:nvPicPr>
+                  <pic:blipFill>
+                    <a:blip r:embed="rId9"/>
+                    <a:stretch>
+                      <a:fillRect/>
+                    </a:stretch>
+                  </pic:blipFill>
+                  <pic:spPr>
+                    <a:xfrm>
+                      <a:off x="0" y="0"/>
+                      <a:ext cx="5943600" cy="3185795"/>
+                    </a:xfrm>
+                    <a:prstGeom prst="rect">
+                      <a:avLst/>
+                    </a:prstGeom>
+                  </pic:spPr>
+                </pic:pic>
+              </a:graphicData>
+            </a:graphic>
+          </wp:inline>
+        </w:drawing>
+      </w:r>
+    </w:p>
+    <w:p>
+      <w:pPr>
+        <w:rPr>
+          <w:lang w:val="it-IT"/>
+        </w:rPr>
+      </w:pPr>
+    </w:p>
+    <w:p>
+      <w:pPr>
+        <w:rPr>
+          <w:lang w:val="it-IT"/>
+        </w:rPr>
+      </w:pPr>
+      <w:r>
+        <w:rPr>
+          <w:lang w:val="it-IT"/>
+        </w:rPr>
+        <w:t>From: wie</w:t>
+      </w:r>
+    </w:p>
+    <w:p>
+      <w:pPr>
+        <w:rPr>
+          <w:lang w:val="it-IT"/>
+        </w:rPr>
+      </w:pPr>
+    </w:p>
+    <w:p>
+      <w:pPr>
+        <w:rPr>
+          <w:lang w:val="it-IT"/>
+        </w:rPr>
+      </w:pPr>
+      <w:r>
+        <w:rPr>
+          <w:lang w:val="it-IT"/>
+        </w:rPr>
+        <w:t>FOR J2 ACC</w:t>
+      </w:r>
+    </w:p>
+    <w:p>
+      <w:pPr>
+        <w:rPr>
+          <w:lang w:val="it-IT"/>
+        </w:rPr>
+      </w:pPr>
+      <w:r>
+        <w:rPr>
+          <w:lang w:val="it-IT"/>
+        </w:rPr>
+        <w:drawing>
+          <wp:inline distT="0" distB="0" distL="0" distR="0" wp14:anchorId="3EA8CA5F" wp14:editId="41FC89C8">
+            <wp:extent cx="5943600" cy="5935345"/>
+            <wp:effectExtent l="0" t="0" r="0" b="8255"/>
+            <wp:docPr id="1398957714" name="Picture 1"/>
+            <wp:cNvGraphicFramePr>
+              <a:graphicFrameLocks xmlns:a="http://schemas.openxmlformats.org/drawingml/2006/main" noChangeAspect="1"/>
+            </wp:cNvGraphicFramePr>
+            <a:graphic xmlns:a="http://schemas.openxmlformats.org/drawingml/2006/main">
+              <a:graphicData uri="http://schemas.openxmlformats.org/drawingml/2006/picture">
+                <pic:pic xmlns:pic="http://schemas.openxmlformats.org/drawingml/2006/picture">
+                  <pic:nvPicPr>
+                    <pic:cNvPr id="1398957714" name=""/>
+                    <pic:cNvPicPr/>
+                  </pic:nvPicPr>
+                  <pic:blipFill>
+                    <a:blip r:embed="rId10"/>
+                    <a:stretch>
+                      <a:fillRect/>
+                    </a:stretch>
+                  </pic:blipFill>
+                  <pic:spPr>
+                    <a:xfrm>
+                      <a:off x="0" y="0"/>
+                      <a:ext cx="5943600" cy="5935345"/>
+                    </a:xfrm>
+                    <a:prstGeom prst="rect">
+                      <a:avLst/>
+                    </a:prstGeom>
+                  </pic:spPr>
+                </pic:pic>
+              </a:graphicData>
+            </a:graphic>
+          </wp:inline>
+        </w:drawing>
+      </w:r>
+    </w:p>
+    <w:p>
+      <w:r>
+        <w:t>FOR THE RELATIVE MOTION (t</w:t>
+      </w:r>
+      <w:r>
+        <w:t>o get the angular velocity)</w:t>
+      </w:r>
+    </w:p>
+    <w:p>
+      <w:pPr>
+        <w:rPr>
+          <w:lang w:val="it-IT"/>
+        </w:rPr>
+      </w:pPr>
+      <w:r>
+        <w:rPr>
+          <w:lang w:val="it-IT"/>
+        </w:rPr>
+        <w:lastRenderedPageBreak/>
+        <w:drawing>
+          <wp:inline distT="0" distB="0" distL="0" distR="0" wp14:anchorId="3FAF7C0B" wp14:editId="61199A84">
+            <wp:extent cx="4135039" cy="5059680"/>
+            <wp:effectExtent l="0" t="0" r="0" b="7620"/>
+            <wp:docPr id="1890571137" name="Picture 1"/>
+            <wp:cNvGraphicFramePr>
+              <a:graphicFrameLocks xmlns:a="http://schemas.openxmlformats.org/drawingml/2006/main" noChangeAspect="1"/>
+            </wp:cNvGraphicFramePr>
+            <a:graphic xmlns:a="http://schemas.openxmlformats.org/drawingml/2006/main">
+              <a:graphicData uri="http://schemas.openxmlformats.org/drawingml/2006/picture">
+                <pic:pic xmlns:pic="http://schemas.openxmlformats.org/drawingml/2006/picture">
+                  <pic:nvPicPr>
+                    <pic:cNvPr id="1890571137" name=""/>
+                    <pic:cNvPicPr/>
+                  </pic:nvPicPr>
+                  <pic:blipFill>
+                    <a:blip r:embed="rId11"/>
+                    <a:stretch>
+                      <a:fillRect/>
+                    </a:stretch>
+                  </pic:blipFill>
+                  <pic:spPr>
+                    <a:xfrm>
+                      <a:off x="0" y="0"/>
+                      <a:ext cx="4139484" cy="5065118"/>
+                    </a:xfrm>
+                    <a:prstGeom prst="rect">
+                      <a:avLst/>
+                    </a:prstGeom>
+                  </pic:spPr>
+                </pic:pic>
+              </a:graphicData>
+            </a:graphic>
+          </wp:inline>
+        </w:drawing>
+      </w:r>
+    </w:p>
+    <w:p>
+      <w:pPr>
+        <w:rPr>
+          <w:lang w:val="it-IT"/>
+        </w:rPr>
+      </w:pPr>
+    </w:p>
+    <w:p>
+      <w:r>
+        <w:t>Q matrix for model er</w:t>
+      </w:r>
+      <w:r>
+        <w:t>ror</w:t>
+      </w:r>
+    </w:p>
+    <w:p>
+      <w:pPr>
+        <w:rPr>
+          <w:lang w:val="it-IT"/>
+        </w:rPr>
+      </w:pPr>
+      <w:r>
+        <w:rPr>
+          <w:lang w:val="it-IT"/>
+        </w:rPr>
+        <w:drawing>
+          <wp:inline distT="0" distB="0" distL="0" distR="0" wp14:anchorId="56BED6EF" wp14:editId="4FD256E0">
+            <wp:extent cx="3440923" cy="2114550"/>
+            <wp:effectExtent l="0" t="0" r="7620" b="0"/>
+            <wp:docPr id="723799252" name="Picture 1"/>
+            <wp:cNvGraphicFramePr>
+              <a:graphicFrameLocks xmlns:a="http://schemas.openxmlformats.org/drawingml/2006/main" noChangeAspect="1"/>
+            </wp:cNvGraphicFramePr>
+            <a:graphic xmlns:a="http://schemas.openxmlformats.org/drawingml/2006/main">
+              <a:graphicData uri="http://schemas.openxmlformats.org/drawingml/2006/picture">
+                <pic:pic xmlns:pic="http://schemas.openxmlformats.org/drawingml/2006/picture">
+                  <pic:nvPicPr>
+                    <pic:cNvPr id="723799252" name=""/>
+                    <pic:cNvPicPr/>
+                  </pic:nvPicPr>
+                  <pic:blipFill>
+                    <a:blip r:embed="rId12"/>
+                    <a:stretch>
+                      <a:fillRect/>
+                    </a:stretch>
+                  </pic:blipFill>
+                  <pic:spPr>
+                    <a:xfrm>
+                      <a:off x="0" y="0"/>
+                      <a:ext cx="3443844" cy="2116345"/>
+                    </a:xfrm>
+                    <a:prstGeom prst="rect">
+                      <a:avLst/>
+                    </a:prstGeom>
+                  </pic:spPr>
+                </pic:pic>
+              </a:graphicData>
+            </a:graphic>
+          </wp:inline>
+        </w:drawing>
+      </w:r>
     </w:p>
     <w:p>
       <w:pPr>
@@ -951,6 +1374,7 @@
   <w:style w:type="character" w:default="1" w:styleId="DefaultParagraphFont">
     <w:name w:val="Default Paragraph Font"/>
     <w:uiPriority w:val="1"/>
+    <w:semiHidden/>
     <w:unhideWhenUsed/>
   </w:style>
   <w:style w:type="table" w:default="1" w:styleId="TableNormal">

</xml_diff>